<commit_message>
Add delivery tracking and printable business reports
Add delivery employee accounts, assignments, private foreground location tracking, delivery proof, and fulfillment controls.

Add business reports, CSV exports, print layouts, email templates and previews, with regression checks and updated deployment documentation and manuscript.
</commit_message>
<xml_diff>
--- a/issues/paper.docx
+++ b/issues/paper.docx
@@ -422,6 +422,7 @@
     </w:p>
     <w:p>
       <w:pPr>
+        <w:keepNext w:val="0"/>
         <w:spacing w:after="240" w:before="240" w:line="480" w:lineRule="auto"/>
         <w:ind w:left="0" w:right="0" w:firstLine="720"/>
         <w:rPr/>
@@ -435,6 +436,7 @@
     </w:p>
     <w:p>
       <w:pPr>
+        <w:keepNext w:val="0"/>
         <w:spacing w:after="240" w:before="240" w:line="480" w:lineRule="auto"/>
         <w:ind w:left="0" w:right="0" w:firstLine="720"/>
         <w:rPr/>
@@ -448,6 +450,7 @@
     </w:p>
     <w:p>
       <w:pPr>
+        <w:keepNext w:val="0"/>
         <w:spacing w:after="240" w:before="240" w:line="480" w:lineRule="auto"/>
         <w:ind w:left="0" w:right="0" w:firstLine="720"/>
         <w:rPr/>
@@ -461,6 +464,7 @@
     </w:p>
     <w:p>
       <w:pPr>
+        <w:keepNext w:val="0"/>
         <w:spacing w:after="240" w:before="240" w:line="480" w:lineRule="auto"/>
         <w:ind w:left="0" w:right="0" w:firstLine="720"/>
         <w:rPr/>
@@ -474,6 +478,7 @@
     </w:p>
     <w:p>
       <w:pPr>
+        <w:keepNext w:val="0"/>
         <w:spacing w:line="480" w:lineRule="auto"/>
         <w:ind w:left="-15" w:right="60" w:firstLine="720"/>
         <w:rPr/>
@@ -487,6 +492,7 @@
     </w:p>
     <w:p>
       <w:pPr>
+        <w:keepNext w:val="0"/>
         <w:spacing w:after="240" w:before="240" w:line="480" w:lineRule="auto"/>
         <w:ind w:left="0" w:right="0" w:firstLine="720"/>
         <w:rPr/>
@@ -495,7 +501,7 @@
         <w:rPr>
           <w:rtl w:val="0"/>
         </w:rPr>
-        <w:t>To address these problems, the researchers propose TNL-TRACK, a centralized web-based platform for CRM, order and delivery tracking, inventory, and field-agent performance. Admins define product packages and their selling prices and commission terms. Field agents offer those terms, handle customer requests, and enter orders for admin approval. A verified customer portal and guided chatbot provide catalog access, order requests, owned-order status, and tracked agent follow-up. Built-in workflows support durable staff notices, transactional customer updates, and consent-based marketing.</w:t>
+        <w:t>To address these problems, the researchers propose TNL-TRACK, a centralized web-based platform for CRM, order and delivery tracking, inventory, and field-agent performance. Admins define product packages and their selling prices and commission terms. Field agents offer those terms, handle customer requests, and enter orders for admin approval. A verified customer portal and guided chatbot provide catalog access, order requests, owned-order status, and tracked agent follow-up. Built-in workflows support durable staff notices, transactional customer updates, and consent-based marketing. Delivery employees use dedicated role permissions within the same staff sign-in, with an assigned-job dashboard, foreground location sharing, and recorded handoff evidence.</w:t>
       </w:r>
     </w:p>
     <w:p>
@@ -522,6 +528,7 @@
     </w:p>
     <w:p>
       <w:pPr>
+        <w:keepNext w:val="0"/>
         <w:spacing w:after="404" w:line="480" w:lineRule="auto"/>
         <w:ind w:left="-5" w:right="0" w:firstLine="725"/>
         <w:rPr/>
@@ -580,7 +587,7 @@
         <w:rPr>
           <w:rtl w:val="0"/>
         </w:rPr>
-        <w:t xml:space="preserve">2. To automate workflows — order management, deliveries, and inventory. </w:t>
+        <w:t>2. To automate order, delivery, and inventory workflows, including employee dispatch, private foreground location, delivery issues, and recipient/photo evidence.</w:t>
       </w:r>
     </w:p>
     <w:p>
@@ -629,7 +636,7 @@
         <w:drawing>
           <wp:inline>
             <wp:extent cx="5303520" cy="1591056"/>
-            <wp:docPr id="20" name="Picture 20"/>
+            <wp:docPr id="25" name="Picture 25"/>
             <wp:cNvGraphicFramePr>
               <a:graphicFrameLocks noChangeAspect="1"/>
             </wp:cNvGraphicFramePr>
@@ -641,7 +648,7 @@
                     <pic:cNvPicPr/>
                   </pic:nvPicPr>
                   <pic:blipFill>
-                    <a:blip r:embed="rId28"/>
+                    <a:blip r:embed="rId33"/>
                     <a:stretch>
                       <a:fillRect/>
                     </a:stretch>
@@ -693,6 +700,7 @@
     <w:p>
       <w:pPr>
         <w:pStyle w:val="Heading1"/>
+        <w:keepNext w:val="0"/>
         <w:spacing w:after="240" w:before="240" w:line="480" w:lineRule="auto"/>
         <w:ind w:left="0" w:firstLine="720"/>
         <w:jc w:val="both"/>
@@ -707,33 +715,36 @@
           <w:bCs w:val="0"/>
           <w:rtl w:val="0"/>
         </w:rPr>
-        <w:t>The inputs include CRM contacts, leads, verified customer accounts, marketing consent, campaigns and schedules; products, stock and package contents; confirmed customer requests, orders, payment records and delivery stages; and field-agent assignments and package commission rules. Package selling prices and fixed or percentage commission values are saved with each request or order.</w:t>
-      </w:r>
-    </w:p>
-    <w:p>
-      <w:pPr>
-        <w:rPr/>
-      </w:pPr>
-      <w:r>
-        <w:rPr>
-          <w:rtl w:val="0"/>
-        </w:rPr>
-        <w:t>The process organizes CRM records and verified customer access, presents catalog offers through staff screens and guided conversations, routes customer requests to an active assigned agent or an admin queue, and converts each request to one pending order. Admin approval reserves aggregated stock and fixes agent credit. Forward delivery deducts stock once; delivery and full payment together earn saved package commission once. A separate worker executes durable events and pending actions with state rechecks, retries, and outcome tracking.</w:t>
-      </w:r>
-    </w:p>
-    <w:p>
-      <w:pPr>
-        <w:rPr/>
-      </w:pPr>
-      <w:r>
-        <w:rPr>
-          <w:rtl w:val="0"/>
-        </w:rPr>
-        <w:t>The outputs include customer and lead records, confirmed request and order histories, safe delivery and payment status, available-stock information, staff notices, customer emails, per-recipient campaign outcomes, completed-sale records, and package commission breakdowns. These outputs support customer communication and operational and field-agent monitoring.</w:t>
-      </w:r>
-    </w:p>
-    <w:p>
-      <w:pPr>
+        <w:t>The inputs include CRM contacts, leads, verified customer accounts, marketing consent, campaigns and schedules; products, stock and package contents; confirmed customer requests, orders, payment records and delivery stages; and field-agent assignments and package commission rules. Package selling prices and fixed or percentage commission values are saved with each request or order. Delivery inputs include employee assignment, destination pins, device fixes, issue explanations, and handoff photos.</w:t>
+      </w:r>
+    </w:p>
+    <w:p>
+      <w:pPr>
+        <w:keepNext w:val="0"/>
+        <w:rPr/>
+      </w:pPr>
+      <w:r>
+        <w:rPr>
+          <w:rtl w:val="0"/>
+        </w:rPr>
+        <w:t>The process organizes CRM records and verified customer access, presents catalog offers through staff screens and guided conversations, routes customer requests to an active assigned agent or an admin queue, and converts each request to one pending order. Admin approval reserves aggregated stock and fixes agent credit. Forward delivery deducts stock once; delivery and full payment together earn saved package commission once. A separate worker executes durable events and pending actions with state rechecks, retries, and outcome tracking. An employee works on one active delivery, shares location while its page is open, and records completion evidence. Admins resolve failed handoffs and explained proof exceptions.</w:t>
+      </w:r>
+    </w:p>
+    <w:p>
+      <w:pPr>
+        <w:keepNext w:val="0"/>
+        <w:rPr/>
+      </w:pPr>
+      <w:r>
+        <w:rPr>
+          <w:rtl w:val="0"/>
+        </w:rPr>
+        <w:t>The outputs include customer and lead records, confirmed request and order histories, safe delivery and payment status, available-stock information, staff notices, customer emails, per-recipient campaign outcomes, completed-sale records, and package commission breakdowns. These outputs support customer communication and operational and field-agent monitoring. Private viewers receive timestamped location and immutable handoff details; public visitors retain a limited status timeline.</w:t>
+      </w:r>
+    </w:p>
+    <w:p>
+      <w:pPr>
+        <w:keepNext w:val="0"/>
         <w:rPr/>
       </w:pPr>
       <w:r>
@@ -763,6 +774,7 @@
     </w:p>
     <w:p>
       <w:pPr>
+        <w:keepNext w:val="0"/>
         <w:spacing w:line="480" w:lineRule="auto"/>
         <w:ind w:left="-15" w:right="60" w:firstLine="720"/>
         <w:rPr/>
@@ -776,6 +788,7 @@
     </w:p>
     <w:p>
       <w:pPr>
+        <w:keepNext w:val="0"/>
         <w:spacing w:line="480" w:lineRule="auto"/>
         <w:ind w:left="-15" w:right="60" w:firstLine="720"/>
         <w:rPr/>
@@ -789,6 +802,7 @@
     </w:p>
     <w:p>
       <w:pPr>
+        <w:keepNext w:val="0"/>
         <w:spacing w:line="480" w:lineRule="auto"/>
         <w:ind w:left="-15" w:right="60" w:firstLine="720"/>
         <w:rPr/>
@@ -802,6 +816,22 @@
     </w:p>
     <w:p>
       <w:pPr>
+        <w:keepNext w:val="0"/>
+        <w:spacing w:line="480" w:lineRule="auto"/>
+        <w:ind w:left="-15" w:right="60" w:firstLine="720"/>
+        <w:rPr/>
+      </w:pPr>
+      <w:r>
+        <w:rPr>
+          <w:rFonts w:ascii="Arial" w:hAnsi="Arial"/>
+          <w:sz w:val="24"/>
+        </w:rPr>
+        <w:t>Delivery employees may have multiple assignments but only one active attempt. Admins assign approved, unfinished live orders independently of the credited sales agent and optionally place destination pins against the saved address. Pausing or reporting an issue closes the attempt and sharing while preserving milestones and reserved stock; issues require admin resolution before retry. Employee completion requires recipient name and an uploaded photo, while an admin may record a recipient and an explained exception. Proof becomes immutable. Imported records remain read-only and historical completions receive no inferred evidence.</w:t>
+      </w:r>
+    </w:p>
+    <w:p>
+      <w:pPr>
+        <w:keepNext w:val="0"/>
         <w:spacing w:line="480" w:lineRule="auto"/>
         <w:ind w:left="-15" w:right="60" w:firstLine="720"/>
         <w:rPr>
@@ -818,6 +848,7 @@
     </w:p>
     <w:p>
       <w:pPr>
+        <w:keepNext w:val="0"/>
         <w:spacing w:after="240" w:before="240" w:line="480" w:lineRule="auto"/>
         <w:ind w:left="0" w:right="0" w:firstLine="720"/>
         <w:rPr/>
@@ -826,11 +857,12 @@
         <w:rPr>
           <w:rtl w:val="0"/>
         </w:rPr>
-        <w:t xml:space="preserve">This study is limited to the operational requirements and business processes of TNL IT &amp; Mobile Enterprises and only covers the functions identified under the three specific objectives of the study: CRM, workflow automation, and agent performance management. The system is intended for use by authorized administrators, agents, and customers, with access to system functions determined by their assigned roles and permissions. The study does not include CRM functions that require customer information not collected or required by the company, and the system's communication and marketing functions are limited to the customer information and communication channels supported by the available system data. </w:t>
-      </w:r>
-    </w:p>
-    <w:p>
-      <w:pPr>
+        <w:t xml:space="preserve">This study is limited to the operational requirements and business processes of TNL IT &amp; Mobile Enterprises and only covers the functions identified under the three specific objectives of the study: CRM, workflow automation, and agent performance management. The system is intended for use by authorized administrators, field agents, delivery employees, and customers, with access to system functions determined by their assigned roles and permissions. The study does not include CRM functions that require customer information not collected or required by the company, and the system's communication and marketing functions are limited to the customer information and communication channels supported by the available system data. </w:t>
+      </w:r>
+    </w:p>
+    <w:p>
+      <w:pPr>
+        <w:keepNext w:val="0"/>
         <w:spacing w:after="240" w:before="240" w:line="480" w:lineRule="auto"/>
         <w:ind w:left="0" w:right="0" w:firstLine="720"/>
         <w:rPr/>
@@ -839,11 +871,12 @@
         <w:rPr>
           <w:rtl w:val="0"/>
         </w:rPr>
-        <w:t>Workflow automation is limited to configured order updates, approval/payment/delivery reminders, low-stock notices, one-time scheduled campaigns, opted-in welcome and purchase follow-up emails, and durable staff notices. Scheduling uses Asia/Manila and UTC storage. The application records payments through authorized staff; external banking, payment gateways, external logistics integration, POS, payroll, refunds, commission adjustments and payouts are excluded. The guided chatbot uses predefined topics with live data rather than an LLM or platform dependency, and follow-up is a tracked agent request rather than general live chat. The system is web-based.</w:t>
-      </w:r>
-    </w:p>
-    <w:p>
-      <w:pPr>
+        <w:t>Workflow automation is limited to configured order updates, approval/payment/delivery reminders, low-stock notices, one-time scheduled campaigns, opted-in welcome and purchase follow-up emails, and durable staff notices. Scheduling uses Asia/Manila and UTC storage. The application records payments through authorized staff; external banking, payment gateways, external logistics integration, POS, payroll, refunds, commission adjustments and payouts are excluded. The guided chatbot uses predefined topics with live data rather than an LLM or platform dependency, and follow-up is a tracked agent request rather than general live chat. The system is web-based. Private maps use Leaflet and OpenStreetMap tiles. Location is available while the active delivery page is visible, with permission and HTTPS; background tracking, road routing, ETA and offline synchronization are excluded. Private photos expire after 90 days, retaining completion and audit metadata.</w:t>
+      </w:r>
+    </w:p>
+    <w:p>
+      <w:pPr>
+        <w:keepNext w:val="0"/>
         <w:spacing w:after="240" w:before="240" w:line="480" w:lineRule="auto"/>
         <w:ind w:left="0" w:right="0" w:firstLine="720"/>
         <w:rPr/>
@@ -879,26 +912,15 @@
       </w:pPr>
       <w:r>
         <w:rPr>
-          <w:rtl w:val="0"/>
-        </w:rPr>
-        <w:t xml:space="preserve">This study, covers the development of TNL-Track: An Integration of Customer Relationship Management, Tracking, and Agent Management, which </w:t>
-      </w:r>
-    </w:p>
-    <w:p>
-      <w:pPr>
-        <w:spacing w:after="415" w:line="480" w:lineRule="auto"/>
-        <w:ind w:left="-5" w:right="60" w:hanging="10"/>
-        <w:rPr/>
-      </w:pPr>
-      <w:r>
-        <w:rPr>
-          <w:rtl w:val="0"/>
-        </w:rPr>
-        <w:t xml:space="preserve">will be significant to the following: </w:t>
-      </w:r>
-    </w:p>
-    <w:p>
-      <w:pPr>
+          <w:rFonts w:ascii="Arial" w:hAnsi="Arial"/>
+          <w:sz w:val="24"/>
+        </w:rPr>
+        <w:t>TNL-TRACK will support the following stakeholders.</w:t>
+      </w:r>
+    </w:p>
+    <w:p>
+      <w:pPr>
+        <w:keepNext w:val="0"/>
         <w:spacing w:after="0" w:line="480" w:lineRule="auto"/>
         <w:ind w:left="-5" w:right="60" w:hanging="10"/>
         <w:rPr/>
@@ -922,6 +944,7 @@
     </w:p>
     <w:p>
       <w:pPr>
+        <w:keepNext w:val="0"/>
         <w:spacing w:after="0" w:line="480" w:lineRule="auto"/>
         <w:ind w:left="-15" w:right="60" w:firstLine="720"/>
         <w:rPr/>
@@ -943,6 +966,22 @@
     </w:p>
     <w:p>
       <w:pPr>
+        <w:keepNext w:val="0"/>
+        <w:spacing w:after="0" w:line="480" w:lineRule="auto"/>
+        <w:ind w:left="-15" w:right="60" w:firstLine="720"/>
+        <w:rPr/>
+      </w:pPr>
+      <w:r>
+        <w:rPr>
+          <w:rFonts w:ascii="Arial" w:hAnsi="Arial"/>
+          <w:sz w:val="24"/>
+        </w:rPr>
+        <w:t>Delivery Employees. TNL-TRACK provides a mobile queue, recipient contact and saved address, next-stage controls, optional location sharing, issue reporting, and a recipient/photo handoff form. Employees can progress their assigned deliveries without GPS permission and cannot manage payments, commissions, sales analytics, or unrelated customer records.</w:t>
+      </w:r>
+    </w:p>
+    <w:p>
+      <w:pPr>
+        <w:keepNext w:val="0"/>
         <w:spacing w:line="480" w:lineRule="auto"/>
         <w:ind w:left="-15" w:right="60" w:firstLine="720"/>
         <w:rPr/>
@@ -953,11 +992,12 @@
           <w:bCs w:val="1"/>
           <w:rtl w:val="0"/>
         </w:rPr>
-        <w:t>Customers can verify their accounts, browse products and packages, submit confirmed requests, view only their own orders and safe delivery/payment details, manage marketing preferences, and read tracked agent replies. Guests may browse, receive budget/category recommendations, and use privacy-limited tracking. The guided chatbot connects these predefined tasks to live backend data.</w:t>
-      </w:r>
-    </w:p>
-    <w:p>
-      <w:pPr>
+        <w:t>Customers can verify their accounts, browse products and packages, submit confirmed requests, view only their own orders and safe delivery/payment details, manage marketing preferences, and read tracked agent replies. Guests may browse, receive budget/category recommendations, and use privacy-limited tracking. The guided chatbot connects these predefined tasks to live backend data. Owned-order views also show authorized live location, fix time and accuracy, and retained completion proof.</w:t>
+      </w:r>
+    </w:p>
+    <w:p>
+      <w:pPr>
+        <w:keepNext w:val="0"/>
         <w:spacing w:line="480" w:lineRule="auto"/>
         <w:ind w:left="-15" w:right="60" w:firstLine="720"/>
         <w:rPr/>
@@ -979,6 +1019,7 @@
     </w:p>
     <w:p>
       <w:pPr>
+        <w:keepNext w:val="0"/>
         <w:spacing w:line="480" w:lineRule="auto"/>
         <w:ind w:left="-15" w:right="60" w:firstLine="720"/>
         <w:rPr/>
@@ -1016,6 +1057,7 @@
     </w:p>
     <w:p>
       <w:pPr>
+        <w:keepNext w:val="0"/>
         <w:spacing w:after="240" w:before="240" w:line="480" w:lineRule="auto"/>
         <w:ind w:left="0" w:right="0" w:firstLine="720"/>
         <w:rPr>
@@ -1045,27 +1087,25 @@
     </w:p>
     <w:p>
       <w:pPr>
-        <w:spacing w:line="480" w:lineRule="auto"/>
-        <w:ind w:left="-15" w:right="60" w:firstLine="720"/>
-        <w:rPr/>
-      </w:pPr>
-      <w:r>
+        <w:keepNext w:val="0"/>
+        <w:spacing w:after="240" w:before="240" w:line="480" w:lineRule="auto"/>
+        <w:ind w:left="0" w:right="0" w:firstLine="720"/>
         <w:rPr>
           <w:b w:val="1"/>
           <w:bCs w:val="1"/>
-          <w:rtl w:val="0"/>
-        </w:rPr>
-        <w:t xml:space="preserve">Customers.</w:t>
-      </w:r>
-      <w:r>
-        <w:rPr>
-          <w:rtl w:val="0"/>
-        </w:rPr>
-        <w:t xml:space="preserve"> It is defined as a person who purchases goods or services from another party. Operationally, this refers to the end-users of TNL IT &amp; Mobile Enterprises, while technically it refers to data entities within the TNL-Track CRM system. </w:t>
-      </w:r>
-    </w:p>
-    <w:p>
-      <w:pPr>
+        </w:rPr>
+      </w:pPr>
+      <w:r>
+        <w:rPr>
+          <w:rFonts w:ascii="Arial" w:hAnsi="Arial"/>
+          <w:sz w:val="24"/>
+        </w:rPr>
+        <w:t>Delivery Employee. A staff member who carries out assigned handoffs. Delivery responsibility is independent of the field agent credited with the sale; one employee can have only one active delivery attempt.</w:t>
+      </w:r>
+    </w:p>
+    <w:p>
+      <w:pPr>
+        <w:keepNext w:val="0"/>
         <w:spacing w:line="480" w:lineRule="auto"/>
         <w:ind w:left="-15" w:right="60" w:firstLine="720"/>
         <w:rPr/>
@@ -1076,17 +1116,18 @@
           <w:bCs w:val="1"/>
           <w:rtl w:val="0"/>
         </w:rPr>
-        <w:t xml:space="preserve">Customer-Relationship Management (CRM).</w:t>
-      </w:r>
-      <w:r>
-        <w:rPr>
-          <w:rtl w:val="0"/>
-        </w:rPr>
-        <w:t xml:space="preserve"> Refers to a business approach and information system used to manage interactions and information involving current and potential customers. Operationally, the CRM component of TNL-TRACK covers contact management, lead management, and marketing automation.</w:t>
-      </w:r>
-    </w:p>
-    <w:p>
-      <w:pPr>
+        <w:t xml:space="preserve">Customers.</w:t>
+      </w:r>
+      <w:r>
+        <w:rPr>
+          <w:rtl w:val="0"/>
+        </w:rPr>
+        <w:t xml:space="preserve"> It is defined as a person who purchases goods or services from another party. Operationally, this refers to the end-users of TNL IT &amp; Mobile Enterprises, while technically it refers to data entities within the TNL-Track CRM system. </w:t>
+      </w:r>
+    </w:p>
+    <w:p>
+      <w:pPr>
+        <w:keepNext w:val="0"/>
         <w:spacing w:line="480" w:lineRule="auto"/>
         <w:ind w:left="-15" w:right="60" w:firstLine="720"/>
         <w:rPr/>
@@ -1097,6 +1138,28 @@
           <w:bCs w:val="1"/>
           <w:rtl w:val="0"/>
         </w:rPr>
+        <w:t xml:space="preserve">Customer-Relationship Management (CRM).</w:t>
+      </w:r>
+      <w:r>
+        <w:rPr>
+          <w:rtl w:val="0"/>
+        </w:rPr>
+        <w:t xml:space="preserve"> Refers to a business approach and information system used to manage interactions and information involving current and potential customers. Operationally, the CRM component of TNL-TRACK covers contact management, lead management, and marketing automation.</w:t>
+      </w:r>
+    </w:p>
+    <w:p>
+      <w:pPr>
+        <w:keepNext w:val="0"/>
+        <w:spacing w:line="480" w:lineRule="auto"/>
+        <w:ind w:left="-15" w:right="60" w:firstLine="720"/>
+        <w:rPr/>
+      </w:pPr>
+      <w:r>
+        <w:rPr>
+          <w:b w:val="1"/>
+          <w:bCs w:val="1"/>
+          <w:rtl w:val="0"/>
+        </w:rPr>
         <w:t xml:space="preserve">Business Owner.</w:t>
       </w:r>
       <w:r>
@@ -1108,6 +1171,7 @@
     </w:p>
     <w:p>
       <w:pPr>
+        <w:keepNext w:val="0"/>
         <w:spacing w:line="480" w:lineRule="auto"/>
         <w:ind w:left="-15" w:right="60" w:firstLine="720"/>
         <w:rPr/>
@@ -1123,6 +1187,7 @@
     </w:p>
     <w:p>
       <w:pPr>
+        <w:keepNext w:val="0"/>
         <w:spacing w:after="0" w:line="480" w:lineRule="auto"/>
         <w:ind w:left="-15" w:right="60" w:firstLine="720"/>
         <w:rPr/>
@@ -1144,6 +1209,7 @@
     </w:p>
     <w:p>
       <w:pPr>
+        <w:keepNext w:val="0"/>
         <w:spacing w:after="0" w:line="480" w:lineRule="auto"/>
         <w:ind w:left="-15" w:right="60" w:firstLine="720"/>
         <w:rPr/>
@@ -1161,6 +1227,21 @@
           <w:rtl w:val="0"/>
         </w:rPr>
         <w:t xml:space="preserve"> Refers to a technological system used to record and monitor the status and progress of operational activities. In TNL-TRACK, tracking refers specifically to monitoring order status, delivery progress, and relevant inventory information.</w:t>
+      </w:r>
+    </w:p>
+    <w:p>
+      <w:pPr>
+        <w:keepNext w:val="0"/>
+        <w:spacing w:after="0" w:line="480" w:lineRule="auto"/>
+        <w:ind w:left="-15" w:right="60" w:firstLine="720"/>
+        <w:rPr/>
+      </w:pPr>
+      <w:r>
+        <w:rPr>
+          <w:rFonts w:ascii="Arial" w:hAnsi="Arial"/>
+          <w:sz w:val="24"/>
+        </w:rPr>
+        <w:t>Foreground Delivery Location. The latest device position reported while an employee shares location on an active, visible delivery page. Positions over 60 seconds are labeled stale and those over ten minutes are unavailable. This does not provide dependable locked-phone tracking.</w:t>
       </w:r>
     </w:p>
     <w:p>
@@ -1179,6 +1260,7 @@
     </w:p>
     <w:p>
       <w:pPr>
+        <w:keepNext w:val="0"/>
         <w:spacing w:line="480" w:lineRule="auto"/>
         <w:ind w:left="705" w:right="60" w:hanging="720"/>
         <w:rPr/>
@@ -1235,6 +1317,7 @@
     </w:p>
     <w:p>
       <w:pPr>
+        <w:keepNext w:val="0"/>
         <w:spacing w:line="480" w:lineRule="auto"/>
         <w:ind w:left="705" w:right="60" w:hanging="720"/>
         <w:rPr/>
@@ -1262,6 +1345,7 @@
     </w:p>
     <w:p>
       <w:pPr>
+        <w:keepNext w:val="0"/>
         <w:spacing w:line="480" w:lineRule="auto"/>
         <w:ind w:left="705" w:right="60" w:hanging="720"/>
         <w:rPr/>
@@ -1289,6 +1373,7 @@
     </w:p>
     <w:p>
       <w:pPr>
+        <w:keepNext w:val="0"/>
         <w:spacing w:line="480" w:lineRule="auto"/>
         <w:ind w:left="705" w:right="60" w:hanging="720"/>
         <w:rPr/>
@@ -1318,6 +1403,7 @@
     </w:p>
     <w:p>
       <w:pPr>
+        <w:keepNext w:val="0"/>
         <w:spacing w:line="480" w:lineRule="auto"/>
         <w:ind w:left="705" w:right="60" w:hanging="720"/>
         <w:rPr/>
@@ -1389,6 +1475,7 @@
     </w:p>
     <w:p>
       <w:pPr>
+        <w:keepNext w:val="0"/>
         <w:spacing w:line="480" w:lineRule="auto"/>
         <w:ind w:left="-5" w:right="60" w:hanging="10"/>
         <w:rPr/>
@@ -1419,6 +1506,7 @@
     </w:p>
     <w:p>
       <w:pPr>
+        <w:keepNext w:val="0"/>
         <w:spacing w:after="240" w:before="240" w:line="480" w:lineRule="auto"/>
         <w:ind w:left="0" w:right="0" w:firstLine="720"/>
         <w:rPr/>
@@ -1432,6 +1520,7 @@
     </w:p>
     <w:p>
       <w:pPr>
+        <w:keepNext w:val="0"/>
         <w:spacing w:after="240" w:before="240" w:line="480" w:lineRule="auto"/>
         <w:ind w:left="0" w:right="0" w:firstLine="720"/>
         <w:rPr/>
@@ -1445,6 +1534,7 @@
     </w:p>
     <w:p>
       <w:pPr>
+        <w:keepNext w:val="0"/>
         <w:spacing w:after="240" w:before="240" w:line="480" w:lineRule="auto"/>
         <w:ind w:left="0" w:right="0" w:firstLine="720"/>
         <w:rPr/>
@@ -1458,6 +1548,7 @@
     </w:p>
     <w:p>
       <w:pPr>
+        <w:keepNext w:val="0"/>
         <w:spacing w:after="240" w:before="240" w:line="480" w:lineRule="auto"/>
         <w:ind w:left="0" w:right="0" w:firstLine="720"/>
         <w:rPr/>
@@ -1471,6 +1562,7 @@
     </w:p>
     <w:p>
       <w:pPr>
+        <w:keepNext w:val="0"/>
         <w:spacing w:after="240" w:before="240" w:line="480" w:lineRule="auto"/>
         <w:ind w:left="0" w:right="0" w:firstLine="720"/>
         <w:rPr/>
@@ -1484,6 +1576,7 @@
     </w:p>
     <w:p>
       <w:pPr>
+        <w:keepNext w:val="0"/>
         <w:spacing w:after="240" w:before="240" w:line="480" w:lineRule="auto"/>
         <w:ind w:left="0" w:right="0" w:firstLine="720"/>
         <w:rPr/>
@@ -1528,6 +1621,7 @@
     </w:p>
     <w:p>
       <w:pPr>
+        <w:keepNext w:val="0"/>
         <w:spacing w:after="412" w:line="480" w:lineRule="auto"/>
         <w:ind w:left="0" w:right="0" w:firstLine="720"/>
         <w:rPr/>
@@ -1541,6 +1635,7 @@
     </w:p>
     <w:p>
       <w:pPr>
+        <w:keepNext w:val="0"/>
         <w:spacing w:after="240" w:before="240" w:line="480" w:lineRule="auto"/>
         <w:ind w:left="0" w:right="0" w:firstLine="720"/>
         <w:rPr/>
@@ -1554,6 +1649,7 @@
     </w:p>
     <w:p>
       <w:pPr>
+        <w:keepNext w:val="0"/>
         <w:spacing w:after="240" w:before="240" w:line="480" w:lineRule="auto"/>
         <w:ind w:left="0" w:right="0" w:firstLine="720"/>
         <w:rPr/>
@@ -1567,6 +1663,7 @@
     </w:p>
     <w:p>
       <w:pPr>
+        <w:keepNext w:val="0"/>
         <w:spacing w:after="240" w:before="240" w:line="480" w:lineRule="auto"/>
         <w:ind w:left="0" w:right="0" w:firstLine="720"/>
         <w:rPr/>
@@ -1580,6 +1677,7 @@
     </w:p>
     <w:p>
       <w:pPr>
+        <w:keepNext w:val="0"/>
         <w:spacing w:after="240" w:before="240" w:line="480" w:lineRule="auto"/>
         <w:ind w:left="0" w:right="0" w:firstLine="720"/>
         <w:rPr/>
@@ -1593,6 +1691,7 @@
     </w:p>
     <w:p>
       <w:pPr>
+        <w:keepNext w:val="0"/>
         <w:spacing w:after="240" w:before="240" w:line="480" w:lineRule="auto"/>
         <w:ind w:left="0" w:right="0" w:firstLine="720"/>
         <w:rPr/>
@@ -1606,6 +1705,7 @@
     </w:p>
     <w:p>
       <w:pPr>
+        <w:keepNext w:val="0"/>
         <w:spacing w:after="240" w:before="240" w:line="480" w:lineRule="auto"/>
         <w:ind w:left="0" w:right="0" w:firstLine="720"/>
         <w:rPr/>
@@ -1619,6 +1719,7 @@
     </w:p>
     <w:p>
       <w:pPr>
+        <w:keepNext w:val="0"/>
         <w:spacing w:after="240" w:before="240" w:line="480" w:lineRule="auto"/>
         <w:ind w:left="0" w:right="0" w:firstLine="720"/>
         <w:rPr/>
@@ -1632,6 +1733,7 @@
     </w:p>
     <w:p>
       <w:pPr>
+        <w:keepNext w:val="0"/>
         <w:spacing w:after="240" w:before="240" w:line="480" w:lineRule="auto"/>
         <w:ind w:left="0" w:right="0" w:firstLine="720"/>
         <w:rPr/>
@@ -1673,6 +1775,7 @@
     </w:p>
     <w:p>
       <w:pPr>
+        <w:keepNext w:val="0"/>
         <w:spacing w:after="240" w:before="240" w:line="480" w:lineRule="auto"/>
         <w:ind w:left="0" w:right="0" w:firstLine="720"/>
         <w:rPr/>
@@ -1686,6 +1789,7 @@
     </w:p>
     <w:p>
       <w:pPr>
+        <w:keepNext w:val="0"/>
         <w:spacing w:after="240" w:before="240" w:line="480" w:lineRule="auto"/>
         <w:ind w:left="0" w:right="0" w:firstLine="720"/>
         <w:rPr/>
@@ -1699,6 +1803,7 @@
     </w:p>
     <w:p>
       <w:pPr>
+        <w:keepNext w:val="0"/>
         <w:spacing w:after="240" w:before="240" w:line="480" w:lineRule="auto"/>
         <w:ind w:left="0" w:right="0" w:firstLine="720"/>
         <w:rPr/>
@@ -1712,6 +1817,7 @@
     </w:p>
     <w:p>
       <w:pPr>
+        <w:keepNext w:val="0"/>
         <w:spacing w:after="240" w:before="240" w:line="480" w:lineRule="auto"/>
         <w:ind w:left="0" w:right="0" w:firstLine="720"/>
         <w:rPr/>
@@ -1725,6 +1831,7 @@
     </w:p>
     <w:p>
       <w:pPr>
+        <w:keepNext w:val="0"/>
         <w:spacing w:after="240" w:before="240" w:line="480" w:lineRule="auto"/>
         <w:ind w:left="0" w:right="0" w:firstLine="720"/>
         <w:rPr/>
@@ -1738,6 +1845,7 @@
     </w:p>
     <w:p>
       <w:pPr>
+        <w:keepNext w:val="0"/>
         <w:spacing w:after="240" w:before="240" w:line="480" w:lineRule="auto"/>
         <w:ind w:left="0" w:right="0" w:firstLine="720"/>
         <w:rPr/>
@@ -1777,6 +1885,7 @@
     </w:p>
     <w:p>
       <w:pPr>
+        <w:keepNext w:val="0"/>
         <w:spacing w:line="480" w:lineRule="auto"/>
         <w:ind w:left="0" w:right="60" w:firstLine="720"/>
         <w:rPr/>
@@ -1797,6 +1906,7 @@
     </w:p>
     <w:p>
       <w:pPr>
+        <w:keepNext w:val="0"/>
         <w:spacing w:line="480" w:lineRule="auto"/>
         <w:ind w:left="0" w:right="60" w:firstLine="720"/>
         <w:rPr/>
@@ -1831,6 +1941,7 @@
     </w:p>
     <w:p>
       <w:pPr>
+        <w:keepNext w:val="0"/>
         <w:spacing w:line="480" w:lineRule="auto"/>
         <w:ind w:left="0" w:right="60" w:firstLine="720"/>
         <w:rPr/>
@@ -1866,6 +1977,7 @@
     </w:p>
     <w:p>
       <w:pPr>
+        <w:keepNext w:val="0"/>
         <w:spacing w:line="480" w:lineRule="auto"/>
         <w:ind w:left="0" w:right="60" w:firstLine="720"/>
         <w:rPr/>
@@ -1887,6 +1999,7 @@
     </w:p>
     <w:p>
       <w:pPr>
+        <w:keepNext w:val="0"/>
         <w:spacing w:line="480" w:lineRule="auto"/>
         <w:ind w:left="0" w:right="60" w:firstLine="720"/>
         <w:rPr>
@@ -1938,6 +2051,7 @@
     </w:p>
     <w:p>
       <w:pPr>
+        <w:keepNext w:val="0"/>
         <w:spacing w:after="240" w:before="240" w:line="480" w:lineRule="auto"/>
         <w:ind w:left="0" w:right="0" w:firstLine="720"/>
         <w:rPr/>
@@ -1951,6 +2065,7 @@
     </w:p>
     <w:p>
       <w:pPr>
+        <w:keepNext w:val="0"/>
         <w:spacing w:after="240" w:before="240" w:line="480" w:lineRule="auto"/>
         <w:ind w:left="0" w:right="0" w:firstLine="720"/>
         <w:rPr/>
@@ -1964,6 +2079,7 @@
     </w:p>
     <w:p>
       <w:pPr>
+        <w:keepNext w:val="0"/>
         <w:spacing w:after="240" w:before="240" w:line="480" w:lineRule="auto"/>
         <w:ind w:left="0" w:right="0" w:firstLine="720"/>
         <w:rPr/>
@@ -1977,6 +2093,7 @@
     </w:p>
     <w:p>
       <w:pPr>
+        <w:keepNext w:val="0"/>
         <w:spacing w:after="240" w:before="240" w:line="480" w:lineRule="auto"/>
         <w:ind w:left="0" w:right="0" w:firstLine="720"/>
         <w:rPr/>
@@ -1990,6 +2107,7 @@
     </w:p>
     <w:p>
       <w:pPr>
+        <w:keepNext w:val="0"/>
         <w:spacing w:after="240" w:before="240" w:line="480" w:lineRule="auto"/>
         <w:ind w:left="0" w:right="0" w:firstLine="720"/>
         <w:rPr/>
@@ -2017,6 +2135,7 @@
     </w:p>
     <w:p>
       <w:pPr>
+        <w:keepNext w:val="0"/>
         <w:spacing w:line="480" w:lineRule="auto"/>
         <w:ind w:left="705" w:right="60" w:hanging="720"/>
         <w:rPr/>
@@ -2085,6 +2204,7 @@
     </w:p>
     <w:p>
       <w:pPr>
+        <w:keepNext w:val="0"/>
         <w:spacing w:line="480" w:lineRule="auto"/>
         <w:ind w:left="705" w:right="60" w:hanging="720"/>
         <w:rPr/>
@@ -2152,6 +2272,7 @@
     </w:p>
     <w:p>
       <w:pPr>
+        <w:keepNext w:val="0"/>
         <w:spacing w:line="480" w:lineRule="auto"/>
         <w:ind w:left="705" w:right="60" w:hanging="720"/>
         <w:rPr/>
@@ -2192,6 +2313,7 @@
     </w:p>
     <w:p>
       <w:pPr>
+        <w:keepNext w:val="0"/>
         <w:spacing w:line="480" w:lineRule="auto"/>
         <w:ind w:left="705" w:right="60" w:hanging="720"/>
         <w:rPr/>
@@ -2219,6 +2341,7 @@
     </w:p>
     <w:p>
       <w:pPr>
+        <w:keepNext w:val="0"/>
         <w:spacing w:line="480" w:lineRule="auto"/>
         <w:ind w:left="705" w:right="60" w:hanging="720"/>
         <w:rPr/>
@@ -2232,6 +2355,7 @@
     </w:p>
     <w:p>
       <w:pPr>
+        <w:keepNext w:val="0"/>
         <w:spacing w:line="480" w:lineRule="auto"/>
         <w:ind w:left="705" w:right="60" w:hanging="720"/>
         <w:rPr/>
@@ -2259,6 +2383,7 @@
     </w:p>
     <w:p>
       <w:pPr>
+        <w:keepNext w:val="0"/>
         <w:spacing w:line="480" w:lineRule="auto"/>
         <w:ind w:left="705" w:right="60" w:hanging="720"/>
         <w:rPr/>
@@ -2313,6 +2438,7 @@
     </w:p>
     <w:p>
       <w:pPr>
+        <w:keepNext w:val="0"/>
         <w:spacing w:line="480" w:lineRule="auto"/>
         <w:ind w:left="705" w:right="60" w:hanging="720"/>
         <w:rPr/>
@@ -2352,6 +2478,7 @@
     </w:p>
     <w:p>
       <w:pPr>
+        <w:keepNext w:val="0"/>
         <w:spacing w:line="480" w:lineRule="auto"/>
         <w:ind w:left="705" w:right="60" w:hanging="720"/>
         <w:rPr/>
@@ -2379,6 +2506,7 @@
     </w:p>
     <w:p>
       <w:pPr>
+        <w:keepNext w:val="0"/>
         <w:spacing w:line="480" w:lineRule="auto"/>
         <w:ind w:left="705" w:right="60" w:hanging="720"/>
         <w:rPr>
@@ -2420,6 +2548,7 @@
     </w:p>
     <w:p>
       <w:pPr>
+        <w:keepNext w:val="0"/>
         <w:spacing w:line="480" w:lineRule="auto"/>
         <w:ind w:left="705" w:right="60" w:hanging="720"/>
         <w:rPr/>
@@ -2447,6 +2576,7 @@
     </w:p>
     <w:p>
       <w:pPr>
+        <w:keepNext w:val="0"/>
         <w:spacing w:line="480" w:lineRule="auto"/>
         <w:ind w:left="705" w:right="60" w:hanging="720"/>
         <w:rPr/>
@@ -2485,6 +2615,7 @@
     </w:p>
     <w:p>
       <w:pPr>
+        <w:keepNext w:val="0"/>
         <w:spacing w:line="480" w:lineRule="auto"/>
         <w:ind w:left="705" w:right="60" w:hanging="720"/>
         <w:rPr/>
@@ -2523,6 +2654,7 @@
     </w:p>
     <w:p>
       <w:pPr>
+        <w:keepNext w:val="0"/>
         <w:spacing w:line="480" w:lineRule="auto"/>
         <w:ind w:left="705" w:right="60" w:hanging="720"/>
         <w:rPr/>
@@ -2561,6 +2693,7 @@
     </w:p>
     <w:p>
       <w:pPr>
+        <w:keepNext w:val="0"/>
         <w:spacing w:line="480" w:lineRule="auto"/>
         <w:ind w:left="705" w:right="60" w:hanging="720"/>
         <w:rPr>
@@ -2602,6 +2735,7 @@
     </w:p>
     <w:p>
       <w:pPr>
+        <w:keepNext w:val="0"/>
         <w:spacing w:line="480" w:lineRule="auto"/>
         <w:ind w:left="705" w:right="60" w:hanging="720"/>
         <w:rPr/>
@@ -2657,6 +2791,7 @@
     </w:p>
     <w:p>
       <w:pPr>
+        <w:keepNext w:val="0"/>
         <w:spacing w:line="480" w:lineRule="auto"/>
         <w:ind w:left="705" w:right="60" w:hanging="720"/>
         <w:rPr/>
@@ -2684,6 +2819,7 @@
     </w:p>
     <w:p>
       <w:pPr>
+        <w:keepNext w:val="0"/>
         <w:spacing w:line="480" w:lineRule="auto"/>
         <w:ind w:left="705" w:right="60" w:hanging="720"/>
         <w:rPr/>
@@ -2717,6 +2853,7 @@
     </w:p>
     <w:p>
       <w:pPr>
+        <w:keepNext w:val="0"/>
         <w:spacing w:line="480" w:lineRule="auto"/>
         <w:ind w:left="705" w:right="60" w:hanging="720"/>
         <w:rPr/>
@@ -2764,6 +2901,7 @@
     </w:p>
     <w:p>
       <w:pPr>
+        <w:keepNext w:val="0"/>
         <w:spacing w:line="480" w:lineRule="auto"/>
         <w:ind w:left="705" w:right="60" w:hanging="720"/>
         <w:rPr/>
@@ -2834,6 +2972,7 @@
     </w:p>
     <w:p>
       <w:pPr>
+        <w:keepNext w:val="0"/>
         <w:spacing w:line="480" w:lineRule="auto"/>
         <w:ind w:left="-15" w:right="60" w:firstLine="720"/>
         <w:rPr/>
@@ -2863,6 +3002,7 @@
     </w:p>
     <w:p>
       <w:pPr>
+        <w:keepNext w:val="0"/>
         <w:spacing w:line="480" w:lineRule="auto"/>
         <w:ind w:left="-5" w:right="60" w:firstLine="725"/>
         <w:rPr/>
@@ -2876,6 +3016,7 @@
     </w:p>
     <w:p>
       <w:pPr>
+        <w:keepNext w:val="0"/>
         <w:spacing w:line="480" w:lineRule="auto"/>
         <w:ind w:left="-5" w:right="60" w:hanging="10"/>
         <w:rPr/>
@@ -2884,7 +3025,7 @@
         <w:rPr>
           <w:rtl w:val="0"/>
         </w:rPr>
-        <w:t>The developmental work guides creation of the web application around those requirements. The platform integrates CRM, package and order management, inventory, delivery stages, verified customer access, and field-agent deals and commissions. Payment recording and completed-sale eligibility follow the agreed business rules.</w:t>
+        <w:t>The developmental work guides creation of the web application around those requirements. The platform integrates CRM, package and order management, inventory, delivery stages, verified customer access, and field-agent deals and commissions. Payment recording and completed-sale eligibility follow the agreed business rules. Delivery employee dispatch, foreground maps, failed-handoff resolutions and private proof extend the delivery workflow without changing stock or commission eligibility.</w:t>
       </w:r>
     </w:p>
     <w:p>
@@ -2906,6 +3047,7 @@
     <w:p>
       <w:pPr>
         <w:pStyle w:val="Heading1"/>
+        <w:keepNext w:val="0"/>
         <w:spacing w:after="404" w:line="480" w:lineRule="auto"/>
         <w:ind w:left="-5" w:firstLine="725"/>
         <w:jc w:val="both"/>
@@ -2920,7 +3062,7 @@
           <w:bCs w:val="0"/>
           <w:rtl w:val="0"/>
         </w:rPr>
-        <w:t>Scrum provides iterative development and feedback for CRM, package sales, inventory and delivery tracking, customer access, and agent performance. Implementation proceeds through sales and commission foundations, durable automation, verified customer requests and follow-up, guided conversation topics, and rollout verification. Focused automated checks verify calculations, concurrency, authorization, token expiry, and worker recovery; documented manual acceptance checks verify staff and customer screens.</w:t>
+        <w:t>Scrum provides iterative development and feedback for CRM, package sales, inventory and delivery tracking, customer access, and agent performance. Implementation proceeds through sales and commission foundations, durable automation, verified customer requests and follow-up, guided conversation topics, and rollout verification. Focused automated checks verify calculations, concurrency, authorization, token expiry, and worker recovery; documented manual acceptance checks verify staff and customer screens. Delivery verification covers role separation, one active job, reassignment fences, image validation/retention, GPS freshness and hidden-page behavior. Actual Android Chrome and iPhone Safari testing over trusted HTTPS remains required; no measured field latency or mobile results are claimed here.</w:t>
       </w:r>
     </w:p>
     <w:p>
@@ -3209,6 +3351,7 @@
     </w:p>
     <w:p>
       <w:pPr>
+        <w:keepNext w:val="0"/>
         <w:spacing w:line="480" w:lineRule="auto"/>
         <w:ind w:left="-5" w:right="60" w:firstLine="725"/>
         <w:rPr/>
@@ -3222,6 +3365,7 @@
     </w:p>
     <w:p>
       <w:pPr>
+        <w:keepNext w:val="0"/>
         <w:spacing w:line="480" w:lineRule="auto"/>
         <w:ind w:left="-5" w:right="60" w:hanging="10"/>
         <w:rPr/>
@@ -3230,11 +3374,12 @@
         <w:rPr>
           <w:rtl w:val="0"/>
         </w:rPr>
-        <w:t>TNL-Track is implemented with Angular 22 and TypeScript for the browser interface, Express 5 and Node.js with TypeScript for the HTTP API, and MySQL 8 with InnoDB for persistence. A separately supervised MySQL-backed worker processes durable automation actions. Both the API and worker must run for a complete deployment; the frontend communicates through the documented HTTP API.</w:t>
-      </w:r>
-    </w:p>
-    <w:p>
-      <w:pPr>
+        <w:t>TNL-Track is implemented with Angular 22 and TypeScript for the browser interface, Express 5 and Node.js with TypeScript for the HTTP API, and MySQL 8 with InnoDB for persistence. A separately supervised MySQL-backed worker processes durable automation actions. Both the API and worker must run for a complete deployment; the frontend communicates through the documented HTTP API. Leaflet 1.9.4 is bundled with the browser application and loaded on map screens. Device geolocation supplies fixes; authenticated REST polling supplies private viewer updates. A persistent private server volume stores normalized delivery JPEGs outside static web roots.</w:t>
+      </w:r>
+    </w:p>
+    <w:p>
+      <w:pPr>
+        <w:keepNext w:val="0"/>
         <w:spacing w:after="0" w:line="480" w:lineRule="auto"/>
         <w:ind w:left="-5" w:right="60" w:firstLine="725"/>
         <w:rPr/>
@@ -3739,6 +3884,7 @@
     </w:p>
     <w:p>
       <w:pPr>
+        <w:keepNext w:val="0"/>
         <w:spacing w:after="441" w:line="480" w:lineRule="auto"/>
         <w:ind w:left="0" w:right="0" w:firstLine="720"/>
         <w:rPr/>
@@ -3752,6 +3898,7 @@
     </w:p>
     <w:p>
       <w:pPr>
+        <w:keepNext w:val="0"/>
         <w:spacing w:after="441" w:line="480" w:lineRule="auto"/>
         <w:ind w:left="0" w:right="0" w:firstLine="720"/>
         <w:rPr/>
@@ -3760,7 +3907,7 @@
         <w:rPr>
           <w:rtl w:val="0"/>
         </w:rPr>
-        <w:t>A desktop, laptop, or phone with a supported browser and reliable access to the deployed HTTPS application can use TNL-Track. Remote operation requires the deployment to expose authorized application access. Delivery information consists of staff-recorded stages; this release does not provide continuous location telemetry or external logistics integration.</w:t>
+        <w:t>A desktop, laptop, or phone with a supported browser and reliable access to the deployed HTTPS application can use TNL-Track. Live location requires device permission and a phone-accessible secure origin. Acquisition and upload run sequentially while the employee page is visible, approximately every ten seconds plus acquisition/network time; private viewers poll every ten seconds. Switching apps or locking a phone may suspend updates. Installing a PWA does not establish dependable background tracking. Denied or unavailable GPS does not block milestone or completion controls.</w:t>
       </w:r>
     </w:p>
     <w:tbl>
@@ -4416,6 +4563,7 @@
     </w:p>
     <w:p>
       <w:pPr>
+        <w:keepNext w:val="0"/>
         <w:spacing w:line="480" w:lineRule="auto"/>
         <w:ind w:left="-5" w:right="60" w:firstLine="725"/>
         <w:rPr/>
@@ -4566,6 +4714,7 @@
     </w:p>
     <w:p>
       <w:pPr>
+        <w:keepNext w:val="0"/>
         <w:spacing w:after="0" w:line="480" w:lineRule="auto"/>
         <w:ind w:left="-15" w:right="60" w:firstLine="720"/>
         <w:rPr/>
@@ -4602,7 +4751,7 @@
         <w:drawing>
           <wp:inline>
             <wp:extent cx="5303520" cy="2651760"/>
-            <wp:docPr id="21" name="Picture 21"/>
+            <wp:docPr id="26" name="Picture 26"/>
             <wp:cNvGraphicFramePr>
               <a:graphicFrameLocks noChangeAspect="1"/>
             </wp:cNvGraphicFramePr>
@@ -4614,7 +4763,7 @@
                     <pic:cNvPicPr/>
                   </pic:nvPicPr>
                   <pic:blipFill>
-                    <a:blip r:embed="rId29"/>
+                    <a:blip r:embed="rId34"/>
                     <a:stretch>
                       <a:fillRect/>
                     </a:stretch>
@@ -4670,6 +4819,7 @@
     </w:p>
     <w:p>
       <w:pPr>
+        <w:keepNext w:val="0"/>
         <w:spacing w:line="480" w:lineRule="auto"/>
         <w:ind w:left="-15" w:right="60" w:firstLine="720"/>
         <w:rPr/>
@@ -4678,11 +4828,12 @@
         <w:rPr>
           <w:rtl w:val="0"/>
         </w:rPr>
-        <w:t>Figure 4 shows staff and customer browser interfaces connecting to the Express API. Public catalog and tracking are separated from staff operations and verified customer ownership. The API validates business actions and commits orders, stock movements, commissions, structured events, and pending actions through MySQL transactions.</w:t>
-      </w:r>
-    </w:p>
-    <w:p>
-      <w:pPr>
+        <w:t>Figure 4 shows staff and customer browser interfaces connecting to the Express API. Public catalog and tracking are separated from staff operations and verified customer ownership. The API validates business actions and commits orders, stock movements, commissions, structured events, and pending actions through MySQL transactions. Delivery uses separate permission-scoped fulfillment responses. Assignment versions, active-attempt uniqueness and location-session identifiers reject stale requests after dispatch changes. GPS updates do not alter delivery milestone timestamps.</w:t>
+      </w:r>
+    </w:p>
+    <w:p>
+      <w:pPr>
+        <w:keepNext w:val="0"/>
         <w:spacing w:line="480" w:lineRule="auto"/>
         <w:ind w:left="-15" w:right="60" w:firstLine="720"/>
         <w:rPr/>
@@ -4691,11 +4842,12 @@
         <w:rPr>
           <w:rtl w:val="0"/>
         </w:rPr>
-        <w:t>A separate worker claims durable pending actions, rechecks current conditions and marketing consent, stores staff notifications, and dispatches customer emails through SMTP. Persisted leases, deduplication keys, attempts, heartbeat, and execution outcomes support recovery. SMTP acceptance is recorded separately from confirmed inbox delivery; uncertain sends require admin review before retry. No payment gateway is integrated.</w:t>
-      </w:r>
-    </w:p>
-    <w:p>
-      <w:pPr>
+        <w:t>A separate worker claims durable pending actions, rechecks current conditions and marketing consent, stores staff notifications, and dispatches customer emails through SMTP. Persisted leases, deduplication keys, attempts, heartbeat, and execution outcomes support recovery. SMTP acceptance is recorded separately from confirmed inbox delivery; uncertain sends require admin review before retry. No payment gateway is integrated. The worker also removes unused/orphaned photos after 24 hours, expires committed photos after 90 days and clears expired location sessions. Database and private-volume backups must be coordinated with a 30-day backup rotation; expired proof is purged before restored service opens.</w:t>
+      </w:r>
+    </w:p>
+    <w:p>
+      <w:pPr>
+        <w:keepNext w:val="0"/>
         <w:spacing w:line="480" w:lineRule="auto"/>
         <w:ind w:left="-15" w:right="60" w:firstLine="720"/>
         <w:rPr/>
@@ -4719,7 +4871,7 @@
         <w:drawing>
           <wp:inline>
             <wp:extent cx="5303520" cy="2651760"/>
-            <wp:docPr id="22" name="Picture 22"/>
+            <wp:docPr id="27" name="Picture 27"/>
             <wp:cNvGraphicFramePr>
               <a:graphicFrameLocks noChangeAspect="1"/>
             </wp:cNvGraphicFramePr>
@@ -4731,7 +4883,7 @@
                     <pic:cNvPicPr/>
                   </pic:nvPicPr>
                   <pic:blipFill>
-                    <a:blip r:embed="rId30"/>
+                    <a:blip r:embed="rId35"/>
                     <a:stretch>
                       <a:fillRect/>
                     </a:stretch>
@@ -4784,6 +4936,7 @@
     </w:p>
     <w:p>
       <w:pPr>
+        <w:keepNext w:val="0"/>
         <w:spacing w:line="480" w:lineRule="auto"/>
         <w:ind w:left="-15" w:right="60" w:firstLine="735"/>
         <w:rPr/>
@@ -4792,11 +4945,12 @@
         <w:rPr>
           <w:rtl w:val="0"/>
         </w:rPr>
-        <w:t>Figure 5 shows the three primary application roles: Customer, Field Agent, and Admin. Guests access public catalog, recommendations, and limited tracking, while verified customers access only their own account-linked records.</w:t>
-      </w:r>
-    </w:p>
-    <w:p>
-      <w:pPr>
+        <w:t>Figure 5 shows four primary roles: Customer, Field Agent, Delivery Employee, and Admin. Guests retain public catalog and limited tracking. Verified customers access only owned records; the responsible field agent can view progress and proof for their own orders. Employee location is shared only with the customer whose order is active.</w:t>
+      </w:r>
+    </w:p>
+    <w:p>
+      <w:pPr>
+        <w:keepNext w:val="0"/>
         <w:spacing w:line="480" w:lineRule="auto"/>
         <w:ind w:left="-15" w:right="60" w:firstLine="735"/>
         <w:rPr/>
@@ -4810,6 +4964,7 @@
     </w:p>
     <w:p>
       <w:pPr>
+        <w:keepNext w:val="0"/>
         <w:spacing w:line="480" w:lineRule="auto"/>
         <w:ind w:left="-5" w:right="60" w:firstLine="725"/>
         <w:rPr/>
@@ -4818,11 +4973,12 @@
         <w:rPr>
           <w:rtl w:val="0"/>
         </w:rPr>
-        <w:t>Admins supply package terms, product and inventory updates, assignments, approval decisions, payment records, and supported automation and campaign configuration.</w:t>
-      </w:r>
-    </w:p>
-    <w:p>
-      <w:pPr>
+        <w:t>Admins supply package terms, product and inventory updates, assignments, approval decisions, payment records, and supported automation and campaign configuration. Admins manage delivery accounts, assignment/reassignment, optional destination pins, issue resolutions and explained no-photo exceptions. Delivery payments remain admin-managed.</w:t>
+      </w:r>
+    </w:p>
+    <w:p>
+      <w:pPr>
+        <w:keepNext w:val="0"/>
         <w:spacing w:line="480" w:lineRule="auto"/>
         <w:ind w:left="-5" w:right="60" w:hanging="10"/>
         <w:rPr/>
@@ -4836,6 +4992,7 @@
     </w:p>
     <w:p>
       <w:pPr>
+        <w:keepNext w:val="0"/>
         <w:spacing w:line="480" w:lineRule="auto"/>
         <w:ind w:left="-5" w:right="60" w:firstLine="725"/>
         <w:rPr/>
@@ -4844,20 +5001,22 @@
         <w:rPr>
           <w:rtl w:val="0"/>
         </w:rPr>
-        <w:t>Field agents enter orders at catalog terms, convert assigned customer requests, update forward delivery stages, and answer tracked follow-ups. The system returns assigned customer context, request and order queues, persistent notices, and earned package commission information.</w:t>
-      </w:r>
-    </w:p>
-    <w:p>
-      <w:pPr>
+        <w:t>Field agents enter orders at catalog terms, convert assigned customer requests, and answer tracked follow-ups. They view delivery progress, maps and proof for their own orders; delivery milestone actions are read-only. The system returns assigned customer context, request and order queues, persistent notices, and earned package commission information.</w:t>
+      </w:r>
+    </w:p>
+    <w:p>
+      <w:pPr>
+        <w:keepNext w:val="0"/>
         <w:spacing w:line="480" w:lineRule="auto"/>
         <w:ind w:left="-5" w:right="60" w:firstLine="725"/>
         <w:rPr/>
       </w:pPr>
       <w:r>
         <w:rPr>
-          <w:rtl w:val="0"/>
-        </w:rPr>
-        <w:t>MySQL transactions enforce stock and financial rules. The independent worker executes committed communication actions and operational reminders. Public tracking and customer read models exclude internal staff information.</w:t>
+          <w:rFonts w:ascii="Arial" w:hAnsi="Arial"/>
+          <w:sz w:val="24"/>
+        </w:rPr>
+        <w:t>Delivery employees receive assigned fulfillment information, work on one active attempt, optionally share location, advance milestones, report failed handoffs, and upload completion proof. Completion closes the attempt and location session. Reassignment, pause, logout and account/session invalidation stop sharing and private responses return no employee coordinates.</w:t>
       </w:r>
     </w:p>
     <w:p>
@@ -4894,7 +5053,7 @@
         <w:drawing>
           <wp:inline>
             <wp:extent cx="7863840" cy="3931920"/>
-            <wp:docPr id="23" name="Picture 23"/>
+            <wp:docPr id="28" name="Picture 28"/>
             <wp:cNvGraphicFramePr>
               <a:graphicFrameLocks noChangeAspect="1"/>
             </wp:cNvGraphicFramePr>
@@ -4906,7 +5065,7 @@
                     <pic:cNvPicPr/>
                   </pic:nvPicPr>
                   <pic:blipFill>
-                    <a:blip r:embed="rId31"/>
+                    <a:blip r:embed="rId36"/>
                     <a:stretch>
                       <a:fillRect/>
                     </a:stretch>
@@ -4978,6 +5137,7 @@
     </w:p>
     <w:p>
       <w:pPr>
+        <w:keepNext w:val="0"/>
         <w:tabs>
           <w:tab w:val="right" w:leader="none" w:pos="8644"/>
         </w:tabs>
@@ -4989,11 +5149,12 @@
         <w:rPr>
           <w:rtl w:val="0"/>
         </w:rPr>
-        <w:t>Figure 6 separates access and account verification, catalog and confirmed request entry, agent handling and admin approval, delivery/payment completion, and durable automation. Staff accounts and verified customer accounts have separate identity and ownership rules.</w:t>
-      </w:r>
-    </w:p>
-    <w:p>
-      <w:pPr>
+        <w:t>Figure 6 separates access and account verification, catalog and confirmed request entry, agent handling and admin approval, delivery/payment completion, and durable automation. Staff accounts and verified customer accounts have separate identity and ownership rules. Delivery dispatch, attempts, location sessions, issue resolution and handoff evidence are distinct from sales-agent credit and payment recording.</w:t>
+      </w:r>
+    </w:p>
+    <w:p>
+      <w:pPr>
+        <w:keepNext w:val="0"/>
         <w:spacing w:after="1" w:line="480" w:lineRule="auto"/>
         <w:ind w:left="-5" w:right="60" w:hanging="10"/>
         <w:rPr/>
@@ -5007,6 +5168,7 @@
     </w:p>
     <w:p>
       <w:pPr>
+        <w:keepNext w:val="0"/>
         <w:spacing w:line="480" w:lineRule="auto"/>
         <w:ind w:left="-5" w:right="60" w:hanging="10"/>
         <w:rPr/>
@@ -5020,6 +5182,7 @@
     </w:p>
     <w:p>
       <w:pPr>
+        <w:keepNext w:val="0"/>
         <w:spacing w:line="480" w:lineRule="auto"/>
         <w:ind w:left="-5" w:right="60" w:firstLine="725"/>
         <w:rPr/>
@@ -5028,11 +5191,12 @@
         <w:rPr>
           <w:rtl w:val="0"/>
         </w:rPr>
-        <w:t>Approval rechecks aggregated component availability, fixes the credited field agent, and reserves inventory. Delivery advances forward and deducts reserved quantities once. Payment and delivery transactions both evaluate whole-order eligibility and post one package commission record only when delivery and full payment are complete.</w:t>
-      </w:r>
-    </w:p>
-    <w:p>
-      <w:pPr>
+        <w:t>Approval rechecks aggregated component availability, fixes the credited field agent, and reserves inventory. Delivery advances forward and deducts reserved quantities once. Payment and delivery transactions both evaluate whole-order eligibility and post one package commission record only when delivery and full payment are complete. Employee completion consumes a photo staged for the current assignment and records recipient, actor and server time; admin exceptions require an explanation. Repeated completion retains the first proof. Pause and failed handoff keep reserved stock until eventual delivery.</w:t>
+      </w:r>
+    </w:p>
+    <w:p>
+      <w:pPr>
+        <w:keepNext w:val="0"/>
         <w:spacing w:line="480" w:lineRule="auto"/>
         <w:ind w:left="-5" w:right="60" w:firstLine="725"/>
         <w:rPr/>
@@ -5046,6 +5210,7 @@
     </w:p>
     <w:p>
       <w:pPr>
+        <w:keepNext w:val="0"/>
         <w:spacing w:after="0" w:line="480" w:lineRule="auto"/>
         <w:ind w:right="60" w:firstLine="720"/>
         <w:rPr/>
@@ -5069,7 +5234,7 @@
         <w:drawing>
           <wp:inline>
             <wp:extent cx="5303520" cy="2651760"/>
-            <wp:docPr id="24" name="Picture 24"/>
+            <wp:docPr id="29" name="Picture 29"/>
             <wp:cNvGraphicFramePr>
               <a:graphicFrameLocks noChangeAspect="1"/>
             </wp:cNvGraphicFramePr>
@@ -5081,7 +5246,7 @@
                     <pic:cNvPicPr/>
                   </pic:nvPicPr>
                   <pic:blipFill>
-                    <a:blip r:embed="rId32"/>
+                    <a:blip r:embed="rId37"/>
                     <a:stretch>
                       <a:fillRect/>
                     </a:stretch>
@@ -5133,6 +5298,7 @@
     </w:p>
     <w:p>
       <w:pPr>
+        <w:keepNext w:val="0"/>
         <w:tabs>
           <w:tab w:val="right" w:leader="none" w:pos="8644"/>
         </w:tabs>
@@ -5144,11 +5310,12 @@
         <w:rPr>
           <w:rtl w:val="0"/>
         </w:rPr>
-        <w:t>Figure 7 summarizes the implemented relational model. Staff users have Admin or Agent roles. CRM customers may have an assigned agent and one verified customer account. Customer requests retain a sales snapshot and may link to exactly one converted order; the order records customer and agent ownership.</w:t>
-      </w:r>
-    </w:p>
-    <w:p>
-      <w:pPr>
+        <w:t>Figure 7 summarizes the relational model. Staff users have Admin, Agent or Delivery roles. CRM customers may have an assigned sales agent and one verified customer account. Requests retain a sales snapshot and may link to one converted order. Orders retain customer/sales-agent ownership plus independent delivery employee assignment, assignment version and optional destination coordinates.</w:t>
+      </w:r>
+    </w:p>
+    <w:p>
+      <w:pPr>
+        <w:keepNext w:val="0"/>
         <w:spacing w:line="480" w:lineRule="auto"/>
         <w:ind w:left="0" w:right="60" w:firstLine="720"/>
         <w:rPr/>
@@ -5157,11 +5324,12 @@
         <w:rPr>
           <w:rtl w:val="0"/>
         </w:rPr>
-        <w:t>Packages connect to products through package_items. Orders store standalone order_items separately from immutable order_packages snapshots, including captured component quantities and commercial terms. Products maintain on-hand and reserved quantities. Inventory movements and delivery_events retain the operational history. Commissions have a unique order reference, credited agent, amount, source, and package breakdown.</w:t>
-      </w:r>
-    </w:p>
-    <w:p>
-      <w:pPr>
+        <w:t>Packages connect to products through package_items. Orders store standalone order_items separately from immutable order_packages snapshots, including captured component quantities and commercial terms. Products maintain on-hand and reserved quantities. Inventory movements and delivery_events retain the operational history. Commissions have a unique order reference, credited agent, amount, source, and package breakdown. delivery_attempts and delivery_active_jobs enforce one active employee and order. delivery_location_sessions link token expiry to one latest position with sequence, fix time, receipt time and accuracy. delivery_issues retain explanations and admin resolutions; delivery_photos retain staged/committed/expired metadata and delivery_completions retain immutable recipient, actor, time and photo or exception.</w:t>
+      </w:r>
+    </w:p>
+    <w:p>
+      <w:pPr>
+        <w:keepNext w:val="0"/>
         <w:spacing w:line="480" w:lineRule="auto"/>
         <w:ind w:left="0" w:right="60" w:firstLine="720"/>
         <w:rPr/>
@@ -5175,6 +5343,7 @@
     </w:p>
     <w:p>
       <w:pPr>
+        <w:keepNext w:val="0"/>
         <w:spacing w:line="480" w:lineRule="auto"/>
         <w:ind w:left="-5" w:right="60" w:hanging="10"/>
         <w:rPr/>
@@ -5183,7 +5352,7 @@
         <w:rPr>
           <w:rtl w:val="0"/>
         </w:rPr>
-        <w:t>The model supports owned customer access, aggregated stock checks, one-time financial posting, durable communication, and controlled recovery. Legacy records are preserved; refunds, payouts, employee payroll, payment gateways, and general messaging entities are outside the implemented scope.</w:t>
+        <w:t>The model supports owned customer access, aggregated stock checks, one-time financial posting, durable communication, and controlled recovery. Legacy records are preserved; refunds, payouts, employee payroll, payment gateways, and general messaging entities are outside the implemented scope. Private maps and proof are authorized by order ownership; public tracking excludes employee coordinates. Leaflet renders maps rather than providing GPS, and public tiles have no service guarantee.</w:t>
       </w:r>
     </w:p>
     <w:p>
@@ -5229,6 +5398,7 @@
     </w:p>
     <w:p>
       <w:pPr>
+        <w:keepNext w:val="0"/>
         <w:spacing w:after="182" w:line="480" w:lineRule="auto"/>
         <w:ind w:left="885" w:right="60" w:hanging="900"/>
         <w:rPr/>
@@ -5292,6 +5462,78 @@
           <w:rtl w:val="0"/>
         </w:rPr>
         <w:t xml:space="preserve">(1), 2344– 2353. </w:t>
+      </w:r>
+    </w:p>
+    <w:p>
+      <w:pPr>
+        <w:spacing w:after="160"/>
+      </w:pPr>
+      <w:r>
+        <w:rPr>
+          <w:rFonts w:ascii="Arial" w:hAnsi="Arial"/>
+          <w:sz w:val="24"/>
+        </w:rPr>
+        <w:t>Leaflet. (n.d.). Download Leaflet. https://leafletjs.com/download.html</w:t>
+      </w:r>
+    </w:p>
+    <w:p>
+      <w:pPr>
+        <w:spacing w:after="160"/>
+      </w:pPr>
+      <w:r>
+        <w:rPr>
+          <w:rFonts w:ascii="Arial" w:hAnsi="Arial"/>
+          <w:sz w:val="24"/>
+        </w:rPr>
+        <w:t>World Wide Web Consortium. (n.d.). Geolocation specification. https://www.w3.org/TR/geolocation/</w:t>
+      </w:r>
+    </w:p>
+    <w:p>
+      <w:pPr>
+        <w:spacing w:after="160"/>
+      </w:pPr>
+      <w:r>
+        <w:rPr>
+          <w:rFonts w:ascii="Arial" w:hAnsi="Arial"/>
+          <w:sz w:val="24"/>
+        </w:rPr>
+        <w:t>Google Chrome Developers. (n.d.). Page Lifecycle API. https://developer.chrome.com/docs/web-platform/page-lifecycle-api</w:t>
+      </w:r>
+    </w:p>
+    <w:p>
+      <w:pPr>
+        <w:spacing w:after="160"/>
+      </w:pPr>
+      <w:r>
+        <w:rPr>
+          <w:rFonts w:ascii="Arial" w:hAnsi="Arial"/>
+          <w:sz w:val="24"/>
+        </w:rPr>
+        <w:t>OpenStreetMap Foundation. (n.d.). Tile Usage Policy. https://operations.osmfoundation.org/policies/tiles/</w:t>
+      </w:r>
+    </w:p>
+    <w:p>
+      <w:pPr>
+        <w:spacing w:after="160"/>
+      </w:pPr>
+      <w:r>
+        <w:rPr>
+          <w:rFonts w:ascii="Arial" w:hAnsi="Arial"/>
+          <w:sz w:val="24"/>
+        </w:rPr>
+        <w:t>OWASP Foundation. (n.d.). File Upload Cheat Sheet. https://cheatsheetseries.owasp.org/cheatsheets/File_Upload_Cheat_Sheet.html</w:t>
+      </w:r>
+    </w:p>
+    <w:p>
+      <w:pPr>
+        <w:spacing w:after="160"/>
+      </w:pPr>
+      <w:r>
+        <w:rPr>
+          <w:rFonts w:ascii="Arial" w:hAnsi="Arial"/>
+          <w:sz w:val="24"/>
+        </w:rPr>
+        <w:t>MDN Web Docs. (n.d.). Secure contexts. https://developer.mozilla.org/en-US/docs/Web/Security/Defenses/Secure_Contexts</w:t>
       </w:r>
     </w:p>
     <w:sectPr>

</xml_diff>